<commit_message>
live-reload for Windows Docker,CSRF works (correct DB host)
</commit_message>
<xml_diff>
--- a/InternMatch_Team_Development_Guide.docx
+++ b/InternMatch_Team_Development_Guide.docx
@@ -35,6 +35,11 @@
         <w:t>Development, Testing, Integration &amp; Deployment Checklist</w:t>
       </w:r>
     </w:p>
+    <w:p>
+      <w:r>
+        <w:t>Additional verification: FR-08 Recommendation Explanation and FR-14 Internship Progress Monitoring and Risk Flagging must be tested explicitly. For geospatial analysis, verify that Haversine outputs straight-line distance in kilometers and do not represent travel time.</w:t>
+      </w:r>
+    </w:p>
     <w:tbl>
       <w:tblPr>
         <w:tblStyle w:val="TableGrid"/>
@@ -316,7 +321,7 @@
               <w:rPr>
                 <w:sz w:val="16"/>
               </w:rPr>
-              <w:t>FastAPI + Python; E5 embeddings + cosine similarity; Leaflet + Haversine</w:t>
+              <w:t>FastAPI + Python; `intfloat/multilingual-e5-base` embeddings + cosine similarity; Leaflet + Haversine</w:t>
             </w:r>
           </w:p>
         </w:tc>
@@ -953,7 +958,7 @@
               <w:rPr>
                 <w:sz w:val="16"/>
               </w:rPr>
-              <w:t>AI/ML Member</w:t>
+              <w:t>AI/ML Member (Angeli Sophia Pancho)</w:t>
             </w:r>
           </w:p>
         </w:tc>
@@ -987,7 +992,7 @@
               <w:rPr>
                 <w:sz w:val="16"/>
               </w:rPr>
-              <w:t>FastAPI, Python, E5, cosine similarity, Logistic Regression</w:t>
+              <w:t>FastAPI, Python, `intfloat/multilingual-e5-base`, cosine similarity, Logistic Regression</w:t>
             </w:r>
           </w:p>
         </w:tc>
@@ -1053,6 +1058,393 @@
       <w:r>
         <w:t>Note: AI/ML ownership is currently unassigned and must be assigned by the team.</w:t>
       </w:r>
+    </w:p>
+    <w:p>
+      <w:pPr>
+        <w:spacing w:before="80" w:after="80"/>
+        <w:rPr>
+          <w:lang w:val="en-PH"/>
+        </w:rPr>
+      </w:pPr>
+      <w:r>
+        <w:rPr>
+          <w:lang w:val="en-PH"/>
+        </w:rPr>
+        <w:lastRenderedPageBreak/>
+        <w:t>Use these statuses consistently:</w:t>
+      </w:r>
+    </w:p>
+    <w:tbl>
+      <w:tblPr>
+        <w:tblW w:w="0" w:type="auto"/>
+        <w:tblCellMar>
+          <w:top w:w="15" w:type="dxa"/>
+          <w:left w:w="15" w:type="dxa"/>
+          <w:bottom w:w="15" w:type="dxa"/>
+          <w:right w:w="15" w:type="dxa"/>
+        </w:tblCellMar>
+        <w:tblLook w:val="04A0" w:firstRow="1" w:lastRow="0" w:firstColumn="1" w:lastColumn="0" w:noHBand="0" w:noVBand="1"/>
+      </w:tblPr>
+      <w:tblGrid>
+        <w:gridCol w:w="819"/>
+        <w:gridCol w:w="1860"/>
+      </w:tblGrid>
+      <w:tr>
+        <w:trPr>
+          <w:trHeight w:val="515"/>
+        </w:trPr>
+        <w:tc>
+          <w:tcPr>
+            <w:tcW w:w="0" w:type="auto"/>
+            <w:tcMar>
+              <w:top w:w="100" w:type="dxa"/>
+              <w:left w:w="100" w:type="dxa"/>
+              <w:bottom w:w="100" w:type="dxa"/>
+              <w:right w:w="100" w:type="dxa"/>
+            </w:tcMar>
+            <w:hideMark/>
+          </w:tcPr>
+          <w:p>
+            <w:pPr>
+              <w:spacing w:before="80" w:after="80"/>
+              <w:rPr>
+                <w:lang w:val="en-PH"/>
+              </w:rPr>
+            </w:pPr>
+            <w:r>
+              <w:rPr>
+                <w:b/>
+                <w:bCs/>
+                <w:lang w:val="en-PH"/>
+              </w:rPr>
+              <w:t>Symbol</w:t>
+            </w:r>
+          </w:p>
+        </w:tc>
+        <w:tc>
+          <w:tcPr>
+            <w:tcW w:w="0" w:type="auto"/>
+            <w:tcMar>
+              <w:top w:w="100" w:type="dxa"/>
+              <w:left w:w="100" w:type="dxa"/>
+              <w:bottom w:w="100" w:type="dxa"/>
+              <w:right w:w="100" w:type="dxa"/>
+            </w:tcMar>
+            <w:hideMark/>
+          </w:tcPr>
+          <w:p>
+            <w:pPr>
+              <w:spacing w:before="80" w:after="80"/>
+              <w:rPr>
+                <w:lang w:val="en-PH"/>
+              </w:rPr>
+            </w:pPr>
+            <w:r>
+              <w:rPr>
+                <w:b/>
+                <w:bCs/>
+                <w:lang w:val="en-PH"/>
+              </w:rPr>
+              <w:t>Meaning</w:t>
+            </w:r>
+          </w:p>
+        </w:tc>
+      </w:tr>
+      <w:tr>
+        <w:trPr>
+          <w:trHeight w:val="545"/>
+        </w:trPr>
+        <w:tc>
+          <w:tcPr>
+            <w:tcW w:w="0" w:type="auto"/>
+            <w:tcMar>
+              <w:top w:w="100" w:type="dxa"/>
+              <w:left w:w="100" w:type="dxa"/>
+              <w:bottom w:w="100" w:type="dxa"/>
+              <w:right w:w="100" w:type="dxa"/>
+            </w:tcMar>
+            <w:hideMark/>
+          </w:tcPr>
+          <w:p>
+            <w:pPr>
+              <w:spacing w:before="80" w:after="80"/>
+              <w:rPr>
+                <w:lang w:val="en-PH"/>
+              </w:rPr>
+            </w:pPr>
+            <w:r>
+              <w:rPr>
+                <w:rFonts w:ascii="Segoe UI Emoji" w:hAnsi="Segoe UI Emoji" w:cs="Segoe UI Emoji"/>
+                <w:lang w:val="en-PH"/>
+              </w:rPr>
+              <w:t>⬜</w:t>
+            </w:r>
+          </w:p>
+        </w:tc>
+        <w:tc>
+          <w:tcPr>
+            <w:tcW w:w="0" w:type="auto"/>
+            <w:tcMar>
+              <w:top w:w="100" w:type="dxa"/>
+              <w:left w:w="100" w:type="dxa"/>
+              <w:bottom w:w="100" w:type="dxa"/>
+              <w:right w:w="100" w:type="dxa"/>
+            </w:tcMar>
+            <w:hideMark/>
+          </w:tcPr>
+          <w:p>
+            <w:pPr>
+              <w:spacing w:before="80" w:after="80"/>
+              <w:rPr>
+                <w:lang w:val="en-PH"/>
+              </w:rPr>
+            </w:pPr>
+            <w:r>
+              <w:rPr>
+                <w:lang w:val="en-PH"/>
+              </w:rPr>
+              <w:t>Not Started</w:t>
+            </w:r>
+          </w:p>
+        </w:tc>
+      </w:tr>
+      <w:tr>
+        <w:trPr>
+          <w:trHeight w:val="545"/>
+        </w:trPr>
+        <w:tc>
+          <w:tcPr>
+            <w:tcW w:w="0" w:type="auto"/>
+            <w:tcMar>
+              <w:top w:w="100" w:type="dxa"/>
+              <w:left w:w="100" w:type="dxa"/>
+              <w:bottom w:w="100" w:type="dxa"/>
+              <w:right w:w="100" w:type="dxa"/>
+            </w:tcMar>
+            <w:hideMark/>
+          </w:tcPr>
+          <w:p>
+            <w:pPr>
+              <w:spacing w:before="80" w:after="80"/>
+              <w:rPr>
+                <w:lang w:val="en-PH"/>
+              </w:rPr>
+            </w:pPr>
+            <w:r>
+              <w:rPr>
+                <w:rFonts w:ascii="Segoe UI Emoji" w:hAnsi="Segoe UI Emoji" w:cs="Segoe UI Emoji"/>
+                <w:lang w:val="en-PH"/>
+              </w:rPr>
+              <w:t>🔵</w:t>
+            </w:r>
+          </w:p>
+        </w:tc>
+        <w:tc>
+          <w:tcPr>
+            <w:tcW w:w="0" w:type="auto"/>
+            <w:tcMar>
+              <w:top w:w="100" w:type="dxa"/>
+              <w:left w:w="100" w:type="dxa"/>
+              <w:bottom w:w="100" w:type="dxa"/>
+              <w:right w:w="100" w:type="dxa"/>
+            </w:tcMar>
+            <w:hideMark/>
+          </w:tcPr>
+          <w:p>
+            <w:pPr>
+              <w:spacing w:before="80" w:after="80"/>
+              <w:rPr>
+                <w:lang w:val="en-PH"/>
+              </w:rPr>
+            </w:pPr>
+            <w:r>
+              <w:rPr>
+                <w:lang w:val="en-PH"/>
+              </w:rPr>
+              <w:t>In Progress</w:t>
+            </w:r>
+          </w:p>
+        </w:tc>
+      </w:tr>
+      <w:tr>
+        <w:trPr>
+          <w:trHeight w:val="545"/>
+        </w:trPr>
+        <w:tc>
+          <w:tcPr>
+            <w:tcW w:w="0" w:type="auto"/>
+            <w:tcMar>
+              <w:top w:w="100" w:type="dxa"/>
+              <w:left w:w="100" w:type="dxa"/>
+              <w:bottom w:w="100" w:type="dxa"/>
+              <w:right w:w="100" w:type="dxa"/>
+            </w:tcMar>
+            <w:hideMark/>
+          </w:tcPr>
+          <w:p>
+            <w:pPr>
+              <w:spacing w:before="80" w:after="80"/>
+              <w:rPr>
+                <w:lang w:val="en-PH"/>
+              </w:rPr>
+            </w:pPr>
+            <w:r>
+              <w:rPr>
+                <w:rFonts w:ascii="Segoe UI Emoji" w:hAnsi="Segoe UI Emoji" w:cs="Segoe UI Emoji"/>
+                <w:lang w:val="en-PH"/>
+              </w:rPr>
+              <w:t>✅</w:t>
+            </w:r>
+          </w:p>
+        </w:tc>
+        <w:tc>
+          <w:tcPr>
+            <w:tcW w:w="0" w:type="auto"/>
+            <w:tcMar>
+              <w:top w:w="100" w:type="dxa"/>
+              <w:left w:w="100" w:type="dxa"/>
+              <w:bottom w:w="100" w:type="dxa"/>
+              <w:right w:w="100" w:type="dxa"/>
+            </w:tcMar>
+            <w:hideMark/>
+          </w:tcPr>
+          <w:p>
+            <w:pPr>
+              <w:spacing w:before="80" w:after="80"/>
+              <w:rPr>
+                <w:lang w:val="en-PH"/>
+              </w:rPr>
+            </w:pPr>
+            <w:r>
+              <w:rPr>
+                <w:lang w:val="en-PH"/>
+              </w:rPr>
+              <w:t>Completed &amp; Verified</w:t>
+            </w:r>
+          </w:p>
+        </w:tc>
+      </w:tr>
+      <w:tr>
+        <w:trPr>
+          <w:trHeight w:val="545"/>
+        </w:trPr>
+        <w:tc>
+          <w:tcPr>
+            <w:tcW w:w="0" w:type="auto"/>
+            <w:tcMar>
+              <w:top w:w="100" w:type="dxa"/>
+              <w:left w:w="100" w:type="dxa"/>
+              <w:bottom w:w="100" w:type="dxa"/>
+              <w:right w:w="100" w:type="dxa"/>
+            </w:tcMar>
+            <w:hideMark/>
+          </w:tcPr>
+          <w:p>
+            <w:pPr>
+              <w:spacing w:before="80" w:after="80"/>
+              <w:rPr>
+                <w:lang w:val="en-PH"/>
+              </w:rPr>
+            </w:pPr>
+            <w:r>
+              <w:rPr>
+                <w:rFonts w:ascii="Segoe UI Emoji" w:hAnsi="Segoe UI Emoji" w:cs="Segoe UI Emoji"/>
+                <w:lang w:val="en-PH"/>
+              </w:rPr>
+              <w:t>🔴</w:t>
+            </w:r>
+          </w:p>
+        </w:tc>
+        <w:tc>
+          <w:tcPr>
+            <w:tcW w:w="0" w:type="auto"/>
+            <w:tcMar>
+              <w:top w:w="100" w:type="dxa"/>
+              <w:left w:w="100" w:type="dxa"/>
+              <w:bottom w:w="100" w:type="dxa"/>
+              <w:right w:w="100" w:type="dxa"/>
+            </w:tcMar>
+            <w:hideMark/>
+          </w:tcPr>
+          <w:p>
+            <w:pPr>
+              <w:spacing w:before="80" w:after="80"/>
+              <w:rPr>
+                <w:lang w:val="en-PH"/>
+              </w:rPr>
+            </w:pPr>
+            <w:r>
+              <w:rPr>
+                <w:lang w:val="en-PH"/>
+              </w:rPr>
+              <w:t>Blocked</w:t>
+            </w:r>
+          </w:p>
+        </w:tc>
+      </w:tr>
+      <w:tr>
+        <w:trPr>
+          <w:trHeight w:val="545"/>
+        </w:trPr>
+        <w:tc>
+          <w:tcPr>
+            <w:tcW w:w="0" w:type="auto"/>
+            <w:tcMar>
+              <w:top w:w="100" w:type="dxa"/>
+              <w:left w:w="100" w:type="dxa"/>
+              <w:bottom w:w="100" w:type="dxa"/>
+              <w:right w:w="100" w:type="dxa"/>
+            </w:tcMar>
+            <w:hideMark/>
+          </w:tcPr>
+          <w:p>
+            <w:pPr>
+              <w:spacing w:before="80" w:after="80"/>
+              <w:rPr>
+                <w:lang w:val="en-PH"/>
+              </w:rPr>
+            </w:pPr>
+            <w:r>
+              <w:rPr>
+                <w:rFonts w:ascii="Segoe UI Emoji" w:hAnsi="Segoe UI Emoji" w:cs="Segoe UI Emoji"/>
+                <w:lang w:val="en-PH"/>
+              </w:rPr>
+              <w:t>🟡</w:t>
+            </w:r>
+          </w:p>
+        </w:tc>
+        <w:tc>
+          <w:tcPr>
+            <w:tcW w:w="0" w:type="auto"/>
+            <w:tcMar>
+              <w:top w:w="100" w:type="dxa"/>
+              <w:left w:w="100" w:type="dxa"/>
+              <w:bottom w:w="100" w:type="dxa"/>
+              <w:right w:w="100" w:type="dxa"/>
+            </w:tcMar>
+            <w:hideMark/>
+          </w:tcPr>
+          <w:p>
+            <w:pPr>
+              <w:spacing w:before="80" w:after="80"/>
+              <w:rPr>
+                <w:lang w:val="en-PH"/>
+              </w:rPr>
+            </w:pPr>
+            <w:r>
+              <w:rPr>
+                <w:lang w:val="en-PH"/>
+              </w:rPr>
+              <w:t>Needs Review</w:t>
+            </w:r>
+          </w:p>
+        </w:tc>
+      </w:tr>
+    </w:tbl>
+    <w:p>
+      <w:pPr>
+        <w:spacing w:before="80" w:after="80"/>
+      </w:pPr>
     </w:p>
     <w:p>
       <w:pPr>
@@ -1105,7 +1497,6 @@
                 <w:b/>
                 <w:sz w:val="16"/>
               </w:rPr>
-              <w:lastRenderedPageBreak/>
               <w:t>Task</w:t>
             </w:r>
           </w:p>
@@ -2409,6 +2800,7 @@
               <w:rPr>
                 <w:sz w:val="16"/>
               </w:rPr>
+              <w:lastRenderedPageBreak/>
               <w:t>Run seeders</w:t>
             </w:r>
           </w:p>
@@ -3524,31 +3916,23 @@
               <w:rPr>
                 <w:sz w:val="16"/>
               </w:rPr>
-              <w:t xml:space="preserve">Correct portal/access per </w:t>
-            </w:r>
-            <w:r>
-              <w:rPr>
-                <w:sz w:val="16"/>
-              </w:rPr>
-              <w:lastRenderedPageBreak/>
-              <w:t>role</w:t>
-            </w:r>
-          </w:p>
-        </w:tc>
-        <w:tc>
-          <w:tcPr>
-            <w:tcW w:w="1461" w:type="dxa"/>
-            <w:vAlign w:val="center"/>
-          </w:tcPr>
-          <w:p>
-            <w:pPr>
-              <w:spacing w:before="80" w:after="80"/>
-            </w:pPr>
-            <w:r>
-              <w:rPr>
-                <w:sz w:val="16"/>
-              </w:rPr>
-              <w:lastRenderedPageBreak/>
+              <w:t>Correct portal/access per role</w:t>
+            </w:r>
+          </w:p>
+        </w:tc>
+        <w:tc>
+          <w:tcPr>
+            <w:tcW w:w="1461" w:type="dxa"/>
+            <w:vAlign w:val="center"/>
+          </w:tcPr>
+          <w:p>
+            <w:pPr>
+              <w:spacing w:before="80" w:after="80"/>
+            </w:pPr>
+            <w:r>
+              <w:rPr>
+                <w:sz w:val="16"/>
+              </w:rPr>
               <w:t>Test each role</w:t>
             </w:r>
           </w:p>
@@ -5005,6 +5389,7 @@
         <w:spacing w:before="80" w:after="80"/>
       </w:pPr>
       <w:r>
+        <w:lastRenderedPageBreak/>
         <w:t>PHASE 4 — Student Portal</w:t>
       </w:r>
     </w:p>
@@ -6188,7 +6573,6 @@
               <w:rPr>
                 <w:sz w:val="16"/>
               </w:rPr>
-              <w:lastRenderedPageBreak/>
               <w:t>Monitoring</w:t>
             </w:r>
           </w:p>
@@ -7604,6 +7988,7 @@
         <w:spacing w:before="80" w:after="80"/>
       </w:pPr>
       <w:r>
+        <w:lastRenderedPageBreak/>
         <w:t>PHASE 6 — Filament Coordinator/Admin</w:t>
       </w:r>
     </w:p>
@@ -7709,7 +8094,7 @@
         </w:tc>
         <w:tc>
           <w:tcPr>
-            <w:tcW w:w="1461" w:type="dxa"/>
+            <w:tcW w:w="1534" w:type="dxa"/>
             <w:vAlign w:val="center"/>
           </w:tcPr>
           <w:p>
@@ -7836,7 +8221,7 @@
         </w:tc>
         <w:tc>
           <w:tcPr>
-            <w:tcW w:w="1461" w:type="dxa"/>
+            <w:tcW w:w="1534" w:type="dxa"/>
             <w:vAlign w:val="center"/>
           </w:tcPr>
           <w:p>
@@ -7962,7 +8347,7 @@
         </w:tc>
         <w:tc>
           <w:tcPr>
-            <w:tcW w:w="1461" w:type="dxa"/>
+            <w:tcW w:w="1534" w:type="dxa"/>
             <w:vAlign w:val="center"/>
           </w:tcPr>
           <w:p>
@@ -8088,7 +8473,7 @@
         </w:tc>
         <w:tc>
           <w:tcPr>
-            <w:tcW w:w="1461" w:type="dxa"/>
+            <w:tcW w:w="1534" w:type="dxa"/>
             <w:vAlign w:val="center"/>
           </w:tcPr>
           <w:p>
@@ -8214,7 +8599,7 @@
         </w:tc>
         <w:tc>
           <w:tcPr>
-            <w:tcW w:w="1461" w:type="dxa"/>
+            <w:tcW w:w="1534" w:type="dxa"/>
             <w:vAlign w:val="center"/>
           </w:tcPr>
           <w:p>
@@ -8340,7 +8725,7 @@
         </w:tc>
         <w:tc>
           <w:tcPr>
-            <w:tcW w:w="1461" w:type="dxa"/>
+            <w:tcW w:w="1534" w:type="dxa"/>
             <w:vAlign w:val="center"/>
           </w:tcPr>
           <w:p>
@@ -8466,7 +8851,7 @@
         </w:tc>
         <w:tc>
           <w:tcPr>
-            <w:tcW w:w="1461" w:type="dxa"/>
+            <w:tcW w:w="1534" w:type="dxa"/>
             <w:vAlign w:val="center"/>
           </w:tcPr>
           <w:p>
@@ -8592,7 +8977,7 @@
         </w:tc>
         <w:tc>
           <w:tcPr>
-            <w:tcW w:w="1461" w:type="dxa"/>
+            <w:tcW w:w="1534" w:type="dxa"/>
             <w:vAlign w:val="center"/>
           </w:tcPr>
           <w:p>
@@ -8718,7 +9103,7 @@
         </w:tc>
         <w:tc>
           <w:tcPr>
-            <w:tcW w:w="1461" w:type="dxa"/>
+            <w:tcW w:w="1534" w:type="dxa"/>
             <w:vAlign w:val="center"/>
           </w:tcPr>
           <w:p>
@@ -8787,7 +9172,6 @@
               <w:rPr>
                 <w:sz w:val="16"/>
               </w:rPr>
-              <w:lastRenderedPageBreak/>
               <w:t>Placement decision</w:t>
             </w:r>
           </w:p>
@@ -8845,7 +9229,7 @@
         </w:tc>
         <w:tc>
           <w:tcPr>
-            <w:tcW w:w="1461" w:type="dxa"/>
+            <w:tcW w:w="1534" w:type="dxa"/>
             <w:vAlign w:val="center"/>
           </w:tcPr>
           <w:p>
@@ -8909,6 +9293,154 @@
           <w:p>
             <w:pPr>
               <w:spacing w:before="80" w:after="80"/>
+              <w:rPr>
+                <w:sz w:val="16"/>
+              </w:rPr>
+            </w:pPr>
+            <w:r>
+              <w:rPr>
+                <w:sz w:val="16"/>
+              </w:rPr>
+              <w:t>Analytics</w:t>
+            </w:r>
+          </w:p>
+        </w:tc>
+        <w:tc>
+          <w:tcPr>
+            <w:tcW w:w="1461" w:type="dxa"/>
+            <w:vAlign w:val="center"/>
+          </w:tcPr>
+          <w:p>
+            <w:pPr>
+              <w:spacing w:before="80" w:after="80"/>
+              <w:rPr>
+                <w:sz w:val="16"/>
+              </w:rPr>
+            </w:pPr>
+            <w:r>
+              <w:rPr>
+                <w:sz w:val="16"/>
+              </w:rPr>
+              <w:t>Twinkle</w:t>
+            </w:r>
+          </w:p>
+        </w:tc>
+        <w:tc>
+          <w:tcPr>
+            <w:tcW w:w="1461" w:type="dxa"/>
+            <w:vAlign w:val="center"/>
+          </w:tcPr>
+          <w:p>
+            <w:pPr>
+              <w:spacing w:before="80" w:after="80"/>
+              <w:rPr>
+                <w:sz w:val="16"/>
+              </w:rPr>
+            </w:pPr>
+            <w:r>
+              <w:rPr>
+                <w:sz w:val="16"/>
+              </w:rPr>
+              <w:t>Data available</w:t>
+            </w:r>
+          </w:p>
+        </w:tc>
+        <w:tc>
+          <w:tcPr>
+            <w:tcW w:w="1461" w:type="dxa"/>
+            <w:vAlign w:val="center"/>
+          </w:tcPr>
+          <w:p>
+            <w:pPr>
+              <w:spacing w:before="80" w:after="80"/>
+              <w:rPr>
+                <w:sz w:val="16"/>
+              </w:rPr>
+            </w:pPr>
+            <w:r>
+              <w:rPr>
+                <w:sz w:val="16"/>
+              </w:rPr>
+              <w:t>—</w:t>
+            </w:r>
+          </w:p>
+        </w:tc>
+        <w:tc>
+          <w:tcPr>
+            <w:tcW w:w="1534" w:type="dxa"/>
+            <w:vAlign w:val="center"/>
+          </w:tcPr>
+          <w:p>
+            <w:pPr>
+              <w:spacing w:before="80" w:after="80"/>
+              <w:rPr>
+                <w:sz w:val="16"/>
+              </w:rPr>
+            </w:pPr>
+            <w:r>
+              <w:rPr>
+                <w:sz w:val="16"/>
+              </w:rPr>
+              <w:t>Role-specific statistics shown</w:t>
+            </w:r>
+          </w:p>
+        </w:tc>
+        <w:tc>
+          <w:tcPr>
+            <w:tcW w:w="1461" w:type="dxa"/>
+            <w:vAlign w:val="center"/>
+          </w:tcPr>
+          <w:p>
+            <w:pPr>
+              <w:spacing w:before="80" w:after="80"/>
+              <w:rPr>
+                <w:sz w:val="16"/>
+              </w:rPr>
+            </w:pPr>
+            <w:r>
+              <w:rPr>
+                <w:sz w:val="16"/>
+              </w:rPr>
+              <w:t>Compare with DB</w:t>
+            </w:r>
+          </w:p>
+        </w:tc>
+        <w:tc>
+          <w:tcPr>
+            <w:tcW w:w="1461" w:type="dxa"/>
+            <w:shd w:val="clear" w:color="auto" w:fill="F4CCCC"/>
+            <w:vAlign w:val="center"/>
+          </w:tcPr>
+          <w:p>
+            <w:pPr>
+              <w:spacing w:before="80" w:after="80"/>
+              <w:jc w:val="center"/>
+              <w:rPr>
+                <w:sz w:val="24"/>
+              </w:rPr>
+            </w:pPr>
+            <w:r>
+              <w:rPr>
+                <w:rFonts w:ascii="Segoe UI Emoji" w:hAnsi="Segoe UI Emoji" w:cs="Segoe UI Emoji"/>
+                <w:sz w:val="24"/>
+              </w:rPr>
+              <w:t>🔴</w:t>
+            </w:r>
+          </w:p>
+        </w:tc>
+      </w:tr>
+      <w:tr>
+        <w:trPr>
+          <w:jc w:val="center"/>
+        </w:trPr>
+        <w:tc>
+          <w:tcPr>
+            <w:tcW w:w="1461" w:type="dxa"/>
+            <w:vAlign w:val="center"/>
+          </w:tcPr>
+          <w:p>
+            <w:pPr>
+              <w:spacing w:before="80" w:after="80"/>
             </w:pPr>
             <w:r>
               <w:rPr>
@@ -8971,7 +9503,7 @@
         </w:tc>
         <w:tc>
           <w:tcPr>
-            <w:tcW w:w="1461" w:type="dxa"/>
+            <w:tcW w:w="1534" w:type="dxa"/>
             <w:vAlign w:val="center"/>
           </w:tcPr>
           <w:p>
@@ -9057,13 +9589,13 @@
         <w:tblLook w:val="04A0" w:firstRow="1" w:lastRow="0" w:firstColumn="1" w:lastColumn="0" w:noHBand="0" w:noVBand="1"/>
       </w:tblPr>
       <w:tblGrid>
-        <w:gridCol w:w="1453"/>
-        <w:gridCol w:w="1443"/>
-        <w:gridCol w:w="1453"/>
-        <w:gridCol w:w="1458"/>
+        <w:gridCol w:w="1725"/>
+        <w:gridCol w:w="1296"/>
+        <w:gridCol w:w="1725"/>
+        <w:gridCol w:w="1435"/>
         <w:gridCol w:w="1758"/>
-        <w:gridCol w:w="1441"/>
-        <w:gridCol w:w="1434"/>
+        <w:gridCol w:w="1283"/>
+        <w:gridCol w:w="1218"/>
       </w:tblGrid>
       <w:tr>
         <w:trPr>
@@ -9230,7 +9762,7 @@
               <w:rPr>
                 <w:sz w:val="16"/>
               </w:rPr>
-              <w:t>AI/ML Member</w:t>
+              <w:t>AI/ML Member (Angeli Sophia Pancho)</w:t>
             </w:r>
           </w:p>
         </w:tc>
@@ -9356,7 +9888,7 @@
               <w:rPr>
                 <w:sz w:val="16"/>
               </w:rPr>
-              <w:t>AI/ML Member</w:t>
+              <w:t>AI/ML Member (Angeli Sophia Pancho)</w:t>
             </w:r>
           </w:p>
         </w:tc>
@@ -9465,24 +9997,24 @@
               <w:rPr>
                 <w:sz w:val="16"/>
               </w:rPr>
-              <w:t>Load E5 model</w:t>
-            </w:r>
-          </w:p>
-        </w:tc>
-        <w:tc>
-          <w:tcPr>
-            <w:tcW w:w="1461" w:type="dxa"/>
-            <w:vAlign w:val="center"/>
-          </w:tcPr>
-          <w:p>
-            <w:pPr>
-              <w:spacing w:before="80" w:after="80"/>
-            </w:pPr>
-            <w:r>
-              <w:rPr>
-                <w:sz w:val="16"/>
-              </w:rPr>
-              <w:t>AI/ML Member</w:t>
+              <w:t>Load `intfloat/multilingual-e5-base` model</w:t>
+            </w:r>
+          </w:p>
+        </w:tc>
+        <w:tc>
+          <w:tcPr>
+            <w:tcW w:w="1461" w:type="dxa"/>
+            <w:vAlign w:val="center"/>
+          </w:tcPr>
+          <w:p>
+            <w:pPr>
+              <w:spacing w:before="80" w:after="80"/>
+            </w:pPr>
+            <w:r>
+              <w:rPr>
+                <w:sz w:val="16"/>
+              </w:rPr>
+              <w:t>AI/ML Member (Angeli Sophia Pancho)</w:t>
             </w:r>
           </w:p>
         </w:tc>
@@ -9608,24 +10140,24 @@
               <w:rPr>
                 <w:sz w:val="16"/>
               </w:rPr>
-              <w:t>AI/ML Member</w:t>
-            </w:r>
-          </w:p>
-        </w:tc>
-        <w:tc>
-          <w:tcPr>
-            <w:tcW w:w="1461" w:type="dxa"/>
-            <w:vAlign w:val="center"/>
-          </w:tcPr>
-          <w:p>
-            <w:pPr>
-              <w:spacing w:before="80" w:after="80"/>
-            </w:pPr>
-            <w:r>
-              <w:rPr>
-                <w:sz w:val="16"/>
-              </w:rPr>
-              <w:t>E5 model</w:t>
+              <w:t>AI/ML Member (Angeli Sophia Pancho)</w:t>
+            </w:r>
+          </w:p>
+        </w:tc>
+        <w:tc>
+          <w:tcPr>
+            <w:tcW w:w="1461" w:type="dxa"/>
+            <w:vAlign w:val="center"/>
+          </w:tcPr>
+          <w:p>
+            <w:pPr>
+              <w:spacing w:before="80" w:after="80"/>
+            </w:pPr>
+            <w:r>
+              <w:rPr>
+                <w:sz w:val="16"/>
+              </w:rPr>
+              <w:t>`intfloat/multilingual-e5-base` model</w:t>
             </w:r>
           </w:p>
         </w:tc>
@@ -9734,24 +10266,24 @@
               <w:rPr>
                 <w:sz w:val="16"/>
               </w:rPr>
-              <w:t>AI/ML Member</w:t>
-            </w:r>
-          </w:p>
-        </w:tc>
-        <w:tc>
-          <w:tcPr>
-            <w:tcW w:w="1461" w:type="dxa"/>
-            <w:vAlign w:val="center"/>
-          </w:tcPr>
-          <w:p>
-            <w:pPr>
-              <w:spacing w:before="80" w:after="80"/>
-            </w:pPr>
-            <w:r>
-              <w:rPr>
-                <w:sz w:val="16"/>
-              </w:rPr>
-              <w:t>E5 model</w:t>
+              <w:t>AI/ML Member (Angeli Sophia Pancho)</w:t>
+            </w:r>
+          </w:p>
+        </w:tc>
+        <w:tc>
+          <w:tcPr>
+            <w:tcW w:w="1461" w:type="dxa"/>
+            <w:vAlign w:val="center"/>
+          </w:tcPr>
+          <w:p>
+            <w:pPr>
+              <w:spacing w:before="80" w:after="80"/>
+            </w:pPr>
+            <w:r>
+              <w:rPr>
+                <w:sz w:val="16"/>
+              </w:rPr>
+              <w:t>`intfloat/multilingual-e5-base` model</w:t>
             </w:r>
           </w:p>
         </w:tc>
@@ -9843,6 +10375,7 @@
               <w:rPr>
                 <w:sz w:val="16"/>
               </w:rPr>
+              <w:lastRenderedPageBreak/>
               <w:t>Store embedding provenance</w:t>
             </w:r>
           </w:p>
@@ -9860,7 +10393,7 @@
               <w:rPr>
                 <w:sz w:val="16"/>
               </w:rPr>
-              <w:t>AI/ML Member + Twinkle</w:t>
+              <w:t>AI/ML Member (Angeli Sophia Pancho) + Twinkle</w:t>
             </w:r>
           </w:p>
         </w:tc>
@@ -10151,7 +10684,7 @@
               <w:rPr>
                 <w:sz w:val="16"/>
               </w:rPr>
-              <w:t>AI/ML Member</w:t>
+              <w:t>AI/ML Member (Angeli Sophia Pancho)</w:t>
             </w:r>
           </w:p>
         </w:tc>
@@ -10277,7 +10810,7 @@
               <w:rPr>
                 <w:sz w:val="16"/>
               </w:rPr>
-              <w:t>AI/ML Member</w:t>
+              <w:t>AI/ML Member (Angeli Sophia Pancho)</w:t>
             </w:r>
           </w:p>
         </w:tc>
@@ -10403,7 +10936,7 @@
               <w:rPr>
                 <w:sz w:val="16"/>
               </w:rPr>
-              <w:t>AI/ML Member</w:t>
+              <w:t>AI/ML Member (Angeli Sophia Pancho)</w:t>
             </w:r>
           </w:p>
         </w:tc>
@@ -10529,7 +11062,7 @@
               <w:rPr>
                 <w:sz w:val="16"/>
               </w:rPr>
-              <w:t>AI/ML Member</w:t>
+              <w:t>AI/ML Member (Angeli Sophia Pancho)</w:t>
             </w:r>
           </w:p>
         </w:tc>
@@ -11315,7 +11848,6 @@
               <w:rPr>
                 <w:sz w:val="16"/>
               </w:rPr>
-              <w:lastRenderedPageBreak/>
               <w:t>Collect approved judgments</w:t>
             </w:r>
           </w:p>
@@ -11459,7 +11991,7 @@
               <w:rPr>
                 <w:sz w:val="16"/>
               </w:rPr>
-              <w:t>AI/ML Member</w:t>
+              <w:t>AI/ML Member (Angeli Sophia Pancho)</w:t>
             </w:r>
           </w:p>
         </w:tc>
@@ -11585,7 +12117,7 @@
               <w:rPr>
                 <w:sz w:val="16"/>
               </w:rPr>
-              <w:t>AI/ML Member</w:t>
+              <w:t>AI/ML Member (Angeli Sophia Pancho)</w:t>
             </w:r>
           </w:p>
         </w:tc>
@@ -11711,7 +12243,7 @@
               <w:rPr>
                 <w:sz w:val="16"/>
               </w:rPr>
-              <w:t>AI/ML Member</w:t>
+              <w:t>AI/ML Member (Angeli Sophia Pancho)</w:t>
             </w:r>
           </w:p>
         </w:tc>
@@ -11837,7 +12369,7 @@
               <w:rPr>
                 <w:sz w:val="16"/>
               </w:rPr>
-              <w:t>AI/ML Member</w:t>
+              <w:t>AI/ML Member (Angeli Sophia Pancho)</w:t>
             </w:r>
           </w:p>
         </w:tc>
@@ -12061,6 +12593,7 @@
         <w:spacing w:before="80" w:after="80"/>
       </w:pPr>
       <w:r>
+        <w:lastRenderedPageBreak/>
         <w:t>If sufficient approved data does not exist, use the documented fallback of cosine similarity plus defined placement criteria. Do not claim trained/validated ML without evidence.</w:t>
       </w:r>
     </w:p>
@@ -12139,7 +12672,7 @@
         </w:tc>
         <w:tc>
           <w:tcPr>
-            <w:tcW w:w="1461" w:type="dxa"/>
+            <w:tcW w:w="1534" w:type="dxa"/>
             <w:vAlign w:val="center"/>
           </w:tcPr>
           <w:p>
@@ -12268,7 +12801,7 @@
         </w:tc>
         <w:tc>
           <w:tcPr>
-            <w:tcW w:w="1461" w:type="dxa"/>
+            <w:tcW w:w="1534" w:type="dxa"/>
             <w:vAlign w:val="center"/>
           </w:tcPr>
           <w:p>
@@ -12394,7 +12927,7 @@
         </w:tc>
         <w:tc>
           <w:tcPr>
-            <w:tcW w:w="1461" w:type="dxa"/>
+            <w:tcW w:w="1534" w:type="dxa"/>
             <w:vAlign w:val="center"/>
           </w:tcPr>
           <w:p>
@@ -12520,7 +13053,7 @@
         </w:tc>
         <w:tc>
           <w:tcPr>
-            <w:tcW w:w="1461" w:type="dxa"/>
+            <w:tcW w:w="1534" w:type="dxa"/>
             <w:vAlign w:val="center"/>
           </w:tcPr>
           <w:p>
@@ -12646,7 +13179,7 @@
         </w:tc>
         <w:tc>
           <w:tcPr>
-            <w:tcW w:w="1461" w:type="dxa"/>
+            <w:tcW w:w="1534" w:type="dxa"/>
             <w:vAlign w:val="center"/>
           </w:tcPr>
           <w:p>
@@ -12739,67 +13272,63 @@
         <w:tc>
           <w:tcPr>
             <w:tcW w:w="1461" w:type="dxa"/>
-            <w:vAlign w:val="center"/>
-          </w:tcPr>
-          <w:p>
-            <w:pPr>
-              <w:spacing w:before="80" w:after="80"/>
-            </w:pPr>
-            <w:r>
-              <w:rPr>
-                <w:sz w:val="16"/>
-              </w:rPr>
-              <w:t>Save proposal</w:t>
-            </w:r>
-          </w:p>
-        </w:tc>
-        <w:tc>
-          <w:tcPr>
-            <w:tcW w:w="1461" w:type="dxa"/>
-            <w:vAlign w:val="center"/>
-          </w:tcPr>
-          <w:p>
-            <w:pPr>
-              <w:spacing w:before="80" w:after="80"/>
-            </w:pPr>
-            <w:r>
-              <w:rPr>
-                <w:sz w:val="16"/>
-              </w:rPr>
+          </w:tcPr>
+          <w:p>
+            <w:pPr>
+              <w:spacing w:before="80" w:after="80"/>
+              <w:rPr>
+                <w:sz w:val="16"/>
+              </w:rPr>
+            </w:pPr>
+            <w:r>
+              <w:t>Check agreement status</w:t>
+            </w:r>
+          </w:p>
+        </w:tc>
+        <w:tc>
+          <w:tcPr>
+            <w:tcW w:w="1461" w:type="dxa"/>
+          </w:tcPr>
+          <w:p>
+            <w:pPr>
+              <w:spacing w:before="80" w:after="80"/>
+              <w:rPr>
+                <w:sz w:val="16"/>
+              </w:rPr>
+            </w:pPr>
+            <w:r>
               <w:t>Twinkle</w:t>
             </w:r>
           </w:p>
         </w:tc>
         <w:tc>
           <w:tcPr>
-            <w:tcW w:w="1461" w:type="dxa"/>
-            <w:vAlign w:val="center"/>
-          </w:tcPr>
-          <w:p>
-            <w:pPr>
-              <w:spacing w:before="80" w:after="80"/>
-            </w:pPr>
-            <w:r>
-              <w:rPr>
-                <w:sz w:val="16"/>
-              </w:rPr>
-              <w:t>Allocation logic</w:t>
-            </w:r>
-          </w:p>
-        </w:tc>
-        <w:tc>
-          <w:tcPr>
-            <w:tcW w:w="1461" w:type="dxa"/>
-            <w:vAlign w:val="center"/>
-          </w:tcPr>
-          <w:p>
-            <w:pPr>
-              <w:spacing w:before="80" w:after="80"/>
-            </w:pPr>
-            <w:r>
-              <w:rPr>
-                <w:sz w:val="16"/>
-              </w:rPr>
+            <w:tcW w:w="1534" w:type="dxa"/>
+          </w:tcPr>
+          <w:p>
+            <w:pPr>
+              <w:spacing w:before="80" w:after="80"/>
+              <w:rPr>
+                <w:sz w:val="16"/>
+              </w:rPr>
+            </w:pPr>
+            <w:r>
+              <w:t>Host agreement status</w:t>
+            </w:r>
+          </w:p>
+        </w:tc>
+        <w:tc>
+          <w:tcPr>
+            <w:tcW w:w="1461" w:type="dxa"/>
+          </w:tcPr>
+          <w:p>
+            <w:pPr>
+              <w:spacing w:before="80" w:after="80"/>
+              <w:rPr>
+                <w:sz w:val="16"/>
+              </w:rPr>
+            </w:pPr>
+            <w:r>
               <w:t>—</w:t>
             </w:r>
           </w:p>
@@ -12807,34 +13336,32 @@
         <w:tc>
           <w:tcPr>
             <w:tcW w:w="1461" w:type="dxa"/>
-            <w:vAlign w:val="center"/>
-          </w:tcPr>
-          <w:p>
-            <w:pPr>
-              <w:spacing w:before="80" w:after="80"/>
-            </w:pPr>
-            <w:r>
-              <w:rPr>
-                <w:sz w:val="16"/>
-              </w:rPr>
-              <w:t>Proposal persists</w:t>
-            </w:r>
-          </w:p>
-        </w:tc>
-        <w:tc>
-          <w:tcPr>
-            <w:tcW w:w="1461" w:type="dxa"/>
-            <w:vAlign w:val="center"/>
-          </w:tcPr>
-          <w:p>
-            <w:pPr>
-              <w:spacing w:before="80" w:after="80"/>
-            </w:pPr>
-            <w:r>
-              <w:rPr>
-                <w:sz w:val="16"/>
-              </w:rPr>
-              <w:t>MySQL check</w:t>
+          </w:tcPr>
+          <w:p>
+            <w:pPr>
+              <w:spacing w:before="80" w:after="80"/>
+              <w:rPr>
+                <w:sz w:val="16"/>
+              </w:rPr>
+            </w:pPr>
+            <w:r>
+              <w:t>Hosts with expired/invalid agreements excluded</w:t>
+            </w:r>
+          </w:p>
+        </w:tc>
+        <w:tc>
+          <w:tcPr>
+            <w:tcW w:w="1461" w:type="dxa"/>
+          </w:tcPr>
+          <w:p>
+            <w:pPr>
+              <w:spacing w:before="80" w:after="80"/>
+              <w:rPr>
+                <w:sz w:val="16"/>
+              </w:rPr>
+            </w:pPr>
+            <w:r>
+              <w:t>Test</w:t>
             </w:r>
           </w:p>
         </w:tc>
@@ -12842,12 +13369,14 @@
           <w:tcPr>
             <w:tcW w:w="1461" w:type="dxa"/>
             <w:shd w:val="clear" w:color="auto" w:fill="F4CCCC"/>
-            <w:vAlign w:val="center"/>
           </w:tcPr>
           <w:p>
             <w:pPr>
               <w:spacing w:before="80" w:after="80"/>
               <w:jc w:val="center"/>
+              <w:rPr>
+                <w:sz w:val="24"/>
+              </w:rPr>
             </w:pPr>
             <w:r>
               <w:rPr>
@@ -12875,7 +13404,7 @@
               <w:rPr>
                 <w:sz w:val="16"/>
               </w:rPr>
-              <w:t>Coordinator review</w:t>
+              <w:t>Save proposal</w:t>
             </w:r>
           </w:p>
         </w:tc>
@@ -12898,18 +13427,18 @@
         </w:tc>
         <w:tc>
           <w:tcPr>
-            <w:tcW w:w="1461" w:type="dxa"/>
-            <w:vAlign w:val="center"/>
-          </w:tcPr>
-          <w:p>
-            <w:pPr>
-              <w:spacing w:before="80" w:after="80"/>
-            </w:pPr>
-            <w:r>
-              <w:rPr>
-                <w:sz w:val="16"/>
-              </w:rPr>
-              <w:t>Proposal</w:t>
+            <w:tcW w:w="1534" w:type="dxa"/>
+            <w:vAlign w:val="center"/>
+          </w:tcPr>
+          <w:p>
+            <w:pPr>
+              <w:spacing w:before="80" w:after="80"/>
+            </w:pPr>
+            <w:r>
+              <w:rPr>
+                <w:sz w:val="16"/>
+              </w:rPr>
+              <w:t>Allocation logic</w:t>
             </w:r>
           </w:p>
         </w:tc>
@@ -12943,24 +13472,24 @@
               <w:rPr>
                 <w:sz w:val="16"/>
               </w:rPr>
-              <w:t>Proposal review works</w:t>
-            </w:r>
-          </w:p>
-        </w:tc>
-        <w:tc>
-          <w:tcPr>
-            <w:tcW w:w="1461" w:type="dxa"/>
-            <w:vAlign w:val="center"/>
-          </w:tcPr>
-          <w:p>
-            <w:pPr>
-              <w:spacing w:before="80" w:after="80"/>
-            </w:pPr>
-            <w:r>
-              <w:rPr>
-                <w:sz w:val="16"/>
-              </w:rPr>
-              <w:t>Browser test</w:t>
+              <w:t>Proposal persists</w:t>
+            </w:r>
+          </w:p>
+        </w:tc>
+        <w:tc>
+          <w:tcPr>
+            <w:tcW w:w="1461" w:type="dxa"/>
+            <w:vAlign w:val="center"/>
+          </w:tcPr>
+          <w:p>
+            <w:pPr>
+              <w:spacing w:before="80" w:after="80"/>
+            </w:pPr>
+            <w:r>
+              <w:rPr>
+                <w:sz w:val="16"/>
+              </w:rPr>
+              <w:t>MySQL check</w:t>
             </w:r>
           </w:p>
         </w:tc>
@@ -13001,6 +13530,132 @@
               <w:rPr>
                 <w:sz w:val="16"/>
               </w:rPr>
+              <w:t>Coordinator review</w:t>
+            </w:r>
+          </w:p>
+        </w:tc>
+        <w:tc>
+          <w:tcPr>
+            <w:tcW w:w="1461" w:type="dxa"/>
+            <w:vAlign w:val="center"/>
+          </w:tcPr>
+          <w:p>
+            <w:pPr>
+              <w:spacing w:before="80" w:after="80"/>
+            </w:pPr>
+            <w:r>
+              <w:rPr>
+                <w:sz w:val="16"/>
+              </w:rPr>
+              <w:t>Twinkle</w:t>
+            </w:r>
+          </w:p>
+        </w:tc>
+        <w:tc>
+          <w:tcPr>
+            <w:tcW w:w="1534" w:type="dxa"/>
+            <w:vAlign w:val="center"/>
+          </w:tcPr>
+          <w:p>
+            <w:pPr>
+              <w:spacing w:before="80" w:after="80"/>
+            </w:pPr>
+            <w:r>
+              <w:rPr>
+                <w:sz w:val="16"/>
+              </w:rPr>
+              <w:t>Proposal</w:t>
+            </w:r>
+          </w:p>
+        </w:tc>
+        <w:tc>
+          <w:tcPr>
+            <w:tcW w:w="1461" w:type="dxa"/>
+            <w:vAlign w:val="center"/>
+          </w:tcPr>
+          <w:p>
+            <w:pPr>
+              <w:spacing w:before="80" w:after="80"/>
+            </w:pPr>
+            <w:r>
+              <w:rPr>
+                <w:sz w:val="16"/>
+              </w:rPr>
+              <w:t>—</w:t>
+            </w:r>
+          </w:p>
+        </w:tc>
+        <w:tc>
+          <w:tcPr>
+            <w:tcW w:w="1461" w:type="dxa"/>
+            <w:vAlign w:val="center"/>
+          </w:tcPr>
+          <w:p>
+            <w:pPr>
+              <w:spacing w:before="80" w:after="80"/>
+            </w:pPr>
+            <w:r>
+              <w:rPr>
+                <w:sz w:val="16"/>
+              </w:rPr>
+              <w:t>Proposal review works</w:t>
+            </w:r>
+          </w:p>
+        </w:tc>
+        <w:tc>
+          <w:tcPr>
+            <w:tcW w:w="1461" w:type="dxa"/>
+            <w:vAlign w:val="center"/>
+          </w:tcPr>
+          <w:p>
+            <w:pPr>
+              <w:spacing w:before="80" w:after="80"/>
+            </w:pPr>
+            <w:r>
+              <w:rPr>
+                <w:sz w:val="16"/>
+              </w:rPr>
+              <w:t>Browser test</w:t>
+            </w:r>
+          </w:p>
+        </w:tc>
+        <w:tc>
+          <w:tcPr>
+            <w:tcW w:w="1461" w:type="dxa"/>
+            <w:shd w:val="clear" w:color="auto" w:fill="F4CCCC"/>
+            <w:vAlign w:val="center"/>
+          </w:tcPr>
+          <w:p>
+            <w:pPr>
+              <w:spacing w:before="80" w:after="80"/>
+              <w:jc w:val="center"/>
+            </w:pPr>
+            <w:r>
+              <w:rPr>
+                <w:sz w:val="24"/>
+              </w:rPr>
+              <w:t>🔴</w:t>
+            </w:r>
+          </w:p>
+        </w:tc>
+      </w:tr>
+      <w:tr>
+        <w:trPr>
+          <w:jc w:val="center"/>
+        </w:trPr>
+        <w:tc>
+          <w:tcPr>
+            <w:tcW w:w="1461" w:type="dxa"/>
+            <w:vAlign w:val="center"/>
+          </w:tcPr>
+          <w:p>
+            <w:pPr>
+              <w:spacing w:before="80" w:after="80"/>
+            </w:pPr>
+            <w:r>
+              <w:rPr>
+                <w:sz w:val="16"/>
+              </w:rPr>
               <w:t>Final placement</w:t>
             </w:r>
           </w:p>
@@ -13024,7 +13679,7 @@
         </w:tc>
         <w:tc>
           <w:tcPr>
-            <w:tcW w:w="1461" w:type="dxa"/>
+            <w:tcW w:w="1534" w:type="dxa"/>
             <w:vAlign w:val="center"/>
           </w:tcPr>
           <w:p>
@@ -13796,7 +14451,6 @@
               <w:rPr>
                 <w:sz w:val="16"/>
               </w:rPr>
-              <w:lastRenderedPageBreak/>
               <w:t>Implement Haversine</w:t>
             </w:r>
           </w:p>
@@ -14110,24 +14764,33 @@
                 <w:b/>
                 <w:sz w:val="16"/>
               </w:rPr>
-              <w:t>Assigned Member</w:t>
-            </w:r>
-          </w:p>
-        </w:tc>
-        <w:tc>
-          <w:tcPr>
-            <w:tcW w:w="1461" w:type="dxa"/>
-            <w:vAlign w:val="center"/>
-          </w:tcPr>
-          <w:p>
-            <w:pPr>
-              <w:spacing w:before="80" w:after="80"/>
-            </w:pPr>
+              <w:t xml:space="preserve">Assigned </w:t>
+            </w:r>
             <w:r>
               <w:rPr>
                 <w:b/>
                 <w:sz w:val="16"/>
               </w:rPr>
+              <w:lastRenderedPageBreak/>
+              <w:t>Member</w:t>
+            </w:r>
+          </w:p>
+        </w:tc>
+        <w:tc>
+          <w:tcPr>
+            <w:tcW w:w="1461" w:type="dxa"/>
+            <w:vAlign w:val="center"/>
+          </w:tcPr>
+          <w:p>
+            <w:pPr>
+              <w:spacing w:before="80" w:after="80"/>
+            </w:pPr>
+            <w:r>
+              <w:rPr>
+                <w:b/>
+                <w:sz w:val="16"/>
+              </w:rPr>
+              <w:lastRenderedPageBreak/>
               <w:t>Prerequisites</w:t>
             </w:r>
           </w:p>
@@ -16316,7 +16979,6 @@
               <w:rPr>
                 <w:sz w:val="16"/>
               </w:rPr>
-              <w:lastRenderedPageBreak/>
               <w:t>Placement report</w:t>
             </w:r>
           </w:p>
@@ -16856,6 +17518,7 @@
                 <w:b/>
                 <w:sz w:val="16"/>
               </w:rPr>
+              <w:lastRenderedPageBreak/>
               <w:t>Task</w:t>
             </w:r>
           </w:p>
@@ -19041,7 +19704,6 @@
               <w:rPr>
                 <w:sz w:val="16"/>
               </w:rPr>
-              <w:lastRenderedPageBreak/>
               <w:t>Supervisor evaluation</w:t>
             </w:r>
           </w:p>
@@ -19433,7 +20095,7 @@
         <w:gridCol w:w="1461"/>
         <w:gridCol w:w="1461"/>
         <w:gridCol w:w="1461"/>
-        <w:gridCol w:w="1461"/>
+        <w:gridCol w:w="1524"/>
         <w:gridCol w:w="1461"/>
         <w:gridCol w:w="1461"/>
       </w:tblGrid>
@@ -19443,7 +20105,7 @@
         </w:trPr>
         <w:tc>
           <w:tcPr>
-            <w:tcW w:w="1461" w:type="dxa"/>
+            <w:tcW w:w="1491" w:type="dxa"/>
             <w:vAlign w:val="center"/>
           </w:tcPr>
           <w:p>
@@ -19574,17 +20236,18 @@
         </w:trPr>
         <w:tc>
           <w:tcPr>
-            <w:tcW w:w="1461" w:type="dxa"/>
-            <w:vAlign w:val="center"/>
-          </w:tcPr>
-          <w:p>
-            <w:pPr>
-              <w:spacing w:before="80" w:after="80"/>
-            </w:pPr>
-            <w:r>
-              <w:rPr>
-                <w:sz w:val="16"/>
-              </w:rPr>
+            <w:tcW w:w="1491" w:type="dxa"/>
+            <w:vAlign w:val="center"/>
+          </w:tcPr>
+          <w:p>
+            <w:pPr>
+              <w:spacing w:before="80" w:after="80"/>
+            </w:pPr>
+            <w:r>
+              <w:rPr>
+                <w:sz w:val="16"/>
+              </w:rPr>
+              <w:lastRenderedPageBreak/>
               <w:t>Define pilot hardware</w:t>
             </w:r>
           </w:p>
@@ -19700,7 +20363,7 @@
         </w:trPr>
         <w:tc>
           <w:tcPr>
-            <w:tcW w:w="1461" w:type="dxa"/>
+            <w:tcW w:w="1491" w:type="dxa"/>
             <w:vAlign w:val="center"/>
           </w:tcPr>
           <w:p>
@@ -19826,7 +20489,7 @@
         </w:trPr>
         <w:tc>
           <w:tcPr>
-            <w:tcW w:w="1461" w:type="dxa"/>
+            <w:tcW w:w="1491" w:type="dxa"/>
             <w:vAlign w:val="center"/>
           </w:tcPr>
           <w:p>
@@ -19952,7 +20615,7 @@
         </w:trPr>
         <w:tc>
           <w:tcPr>
-            <w:tcW w:w="1461" w:type="dxa"/>
+            <w:tcW w:w="1491" w:type="dxa"/>
             <w:vAlign w:val="center"/>
           </w:tcPr>
           <w:p>
@@ -20078,7 +20741,7 @@
         </w:trPr>
         <w:tc>
           <w:tcPr>
-            <w:tcW w:w="1461" w:type="dxa"/>
+            <w:tcW w:w="1491" w:type="dxa"/>
             <w:vAlign w:val="center"/>
           </w:tcPr>
           <w:p>
@@ -20204,7 +20867,7 @@
         </w:trPr>
         <w:tc>
           <w:tcPr>
-            <w:tcW w:w="1461" w:type="dxa"/>
+            <w:tcW w:w="1491" w:type="dxa"/>
             <w:vAlign w:val="center"/>
           </w:tcPr>
           <w:p>
@@ -20314,6 +20977,129 @@
             <w:pPr>
               <w:spacing w:before="80" w:after="80"/>
               <w:jc w:val="center"/>
+            </w:pPr>
+            <w:r>
+              <w:rPr>
+                <w:sz w:val="24"/>
+              </w:rPr>
+              <w:t>🔴</w:t>
+            </w:r>
+          </w:p>
+        </w:tc>
+      </w:tr>
+      <w:tr>
+        <w:trPr>
+          <w:jc w:val="center"/>
+        </w:trPr>
+        <w:tc>
+          <w:tcPr>
+            <w:tcW w:w="1491" w:type="dxa"/>
+          </w:tcPr>
+          <w:p>
+            <w:pPr>
+              <w:spacing w:before="80" w:after="80"/>
+              <w:rPr>
+                <w:sz w:val="16"/>
+              </w:rPr>
+            </w:pPr>
+            <w:r>
+              <w:t>Verify remaining NFRs</w:t>
+            </w:r>
+          </w:p>
+        </w:tc>
+        <w:tc>
+          <w:tcPr>
+            <w:tcW w:w="1461" w:type="dxa"/>
+          </w:tcPr>
+          <w:p>
+            <w:pPr>
+              <w:spacing w:before="80" w:after="80"/>
+              <w:rPr>
+                <w:sz w:val="16"/>
+              </w:rPr>
+            </w:pPr>
+            <w:r>
+              <w:t>Shared</w:t>
+            </w:r>
+          </w:p>
+        </w:tc>
+        <w:tc>
+          <w:tcPr>
+            <w:tcW w:w="1461" w:type="dxa"/>
+          </w:tcPr>
+          <w:p>
+            <w:pPr>
+              <w:spacing w:before="80" w:after="80"/>
+              <w:rPr>
+                <w:sz w:val="16"/>
+              </w:rPr>
+            </w:pPr>
+            <w:r>
+              <w:t>Deployment verified</w:t>
+            </w:r>
+          </w:p>
+        </w:tc>
+        <w:tc>
+          <w:tcPr>
+            <w:tcW w:w="1461" w:type="dxa"/>
+          </w:tcPr>
+          <w:p>
+            <w:pPr>
+              <w:spacing w:before="80" w:after="80"/>
+              <w:rPr>
+                <w:sz w:val="16"/>
+              </w:rPr>
+            </w:pPr>
+            <w:r>
+              <w:t>—</w:t>
+            </w:r>
+          </w:p>
+        </w:tc>
+        <w:tc>
+          <w:tcPr>
+            <w:tcW w:w="1461" w:type="dxa"/>
+          </w:tcPr>
+          <w:p>
+            <w:pPr>
+              <w:spacing w:before="80" w:after="80"/>
+              <w:rPr>
+                <w:sz w:val="16"/>
+              </w:rPr>
+            </w:pPr>
+            <w:r>
+              <w:t>Reliability, availability, security, usability, maintainability, compatibility, scalability, data integrity, and backup/recovery each checked against NFR-02–NFR-10</w:t>
+            </w:r>
+          </w:p>
+        </w:tc>
+        <w:tc>
+          <w:tcPr>
+            <w:tcW w:w="1461" w:type="dxa"/>
+          </w:tcPr>
+          <w:p>
+            <w:pPr>
+              <w:spacing w:before="80" w:after="80"/>
+              <w:rPr>
+                <w:sz w:val="16"/>
+              </w:rPr>
+            </w:pPr>
+            <w:r>
+              <w:t>NFR checklist review</w:t>
+            </w:r>
+          </w:p>
+        </w:tc>
+        <w:tc>
+          <w:tcPr>
+            <w:tcW w:w="1461" w:type="dxa"/>
+            <w:shd w:val="clear" w:color="auto" w:fill="F4CCCC"/>
+            <w:vAlign w:val="center"/>
+          </w:tcPr>
+          <w:p>
+            <w:pPr>
+              <w:spacing w:before="80" w:after="80"/>
+              <w:jc w:val="center"/>
+              <w:rPr>
+                <w:sz w:val="24"/>
+              </w:rPr>
             </w:pPr>
             <w:r>
               <w:rPr>
@@ -20901,7 +21687,7 @@
               <w:rPr>
                 <w:sz w:val="16"/>
               </w:rPr>
-              <w:t>AI/ML Member</w:t>
+              <w:t>AI/ML Member (Angeli Sophia Pancho)</w:t>
             </w:r>
           </w:p>
         </w:tc>
@@ -21553,31 +22339,23 @@
               <w:rPr>
                 <w:sz w:val="16"/>
               </w:rPr>
-              <w:t xml:space="preserve">Configure </w:t>
-            </w:r>
-            <w:r>
-              <w:rPr>
-                <w:sz w:val="16"/>
-              </w:rPr>
-              <w:lastRenderedPageBreak/>
-              <w:t>domain/DNS</w:t>
-            </w:r>
-          </w:p>
-        </w:tc>
-        <w:tc>
-          <w:tcPr>
-            <w:tcW w:w="1461" w:type="dxa"/>
-            <w:vAlign w:val="center"/>
-          </w:tcPr>
-          <w:p>
-            <w:pPr>
-              <w:spacing w:before="80" w:after="80"/>
-            </w:pPr>
-            <w:r>
-              <w:rPr>
-                <w:sz w:val="16"/>
-              </w:rPr>
-              <w:lastRenderedPageBreak/>
+              <w:t>Configure domain/DNS</w:t>
+            </w:r>
+          </w:p>
+        </w:tc>
+        <w:tc>
+          <w:tcPr>
+            <w:tcW w:w="1461" w:type="dxa"/>
+            <w:vAlign w:val="center"/>
+          </w:tcPr>
+          <w:p>
+            <w:pPr>
+              <w:spacing w:before="80" w:after="80"/>
+            </w:pPr>
+            <w:r>
+              <w:rPr>
+                <w:sz w:val="16"/>
+              </w:rPr>
               <w:t>Shared</w:t>
             </w:r>
           </w:p>
@@ -21687,6 +22465,7 @@
               <w:rPr>
                 <w:sz w:val="16"/>
               </w:rPr>
+              <w:lastRenderedPageBreak/>
               <w:t>Configure HTTPS/TLS</w:t>
             </w:r>
           </w:p>
@@ -22082,7 +22861,7 @@
               <w:rPr>
                 <w:sz w:val="16"/>
               </w:rPr>
-              <w:t>AI/ML Member</w:t>
+              <w:t>AI/ML Member (Angeli Sophia Pancho)</w:t>
             </w:r>
           </w:p>
         </w:tc>
@@ -22887,7 +23666,7 @@
         <w:spacing w:before="80" w:after="80"/>
       </w:pPr>
       <w:r>
-        <w:t>⬜ FastAPI   ⬜ E5 model   ⬜ Embeddings   ⬜ Cosine similarity   ⬜ Recommendation API   ⬜ Recommendation persistence   ⬜ Coordinator judgment   ⬜ ML validation, if sufficient data exists</w:t>
+        <w:t>⬜ FastAPI   ⬜ `intfloat/multilingual-e5-base` model   ⬜ Embeddings   ⬜ Cosine similarity   ⬜ Recommendation API   ⬜ Recommendation persistence   ⬜ Coordinator judgment   ⬜ ML validation, if sufficient data exists</w:t>
       </w:r>
     </w:p>
     <w:p>
@@ -22993,7 +23772,12 @@
       </w:r>
     </w:p>
     <w:sectPr>
-      <w:footerReference w:type="default" r:id="rId8"/>
+      <w:headerReference w:type="even" r:id="rId8"/>
+      <w:headerReference w:type="default" r:id="rId9"/>
+      <w:footerReference w:type="even" r:id="rId10"/>
+      <w:footerReference w:type="default" r:id="rId11"/>
+      <w:headerReference w:type="first" r:id="rId12"/>
+      <w:footerReference w:type="first" r:id="rId13"/>
       <w:pgSz w:w="12240" w:h="15840"/>
       <w:pgMar w:top="936" w:right="1008" w:bottom="936" w:left="1008" w:header="720" w:footer="720" w:gutter="0"/>
       <w:cols w:space="720"/>
@@ -23033,22 +23817,28 @@
   <w:p>
     <w:pPr>
       <w:pStyle w:val="Footer"/>
+    </w:pPr>
+  </w:p>
+</w:ftr>
+</file>
+
+<file path=word/footer2.xml><?xml version="1.0" encoding="utf-8"?>
+<w:ftr xmlns:wpc="http://schemas.microsoft.com/office/word/2010/wordprocessingCanvas" xmlns:cx="http://schemas.microsoft.com/office/drawing/2014/chartex" xmlns:cx1="http://schemas.microsoft.com/office/drawing/2015/9/8/chartex" xmlns:cx2="http://schemas.microsoft.com/office/drawing/2015/10/21/chartex" xmlns:cx3="http://schemas.microsoft.com/office/drawing/2016/5/9/chartex" xmlns:cx4="http://schemas.microsoft.com/office/drawing/2016/5/10/chartex" xmlns:cx5="http://schemas.microsoft.com/office/drawing/2016/5/11/chartex" xmlns:cx6="http://schemas.microsoft.com/office/drawing/2016/5/12/chartex" xmlns:cx7="http://schemas.microsoft.com/office/drawing/2016/5/13/chartex" xmlns:cx8="http://schemas.microsoft.com/office/drawing/2016/5/14/chartex" xmlns:mc="http://schemas.openxmlformats.org/markup-compatibility/2006" xmlns:aink="http://schemas.microsoft.com/office/drawing/2016/ink" xmlns:am3d="http://schemas.microsoft.com/office/drawing/2017/model3d" xmlns:o="urn:schemas-microsoft-com:office:office" xmlns:oel="http://schemas.microsoft.com/office/2019/extlst" xmlns:r="http://schemas.openxmlformats.org/officeDocument/2006/relationships" xmlns:m="http://schemas.openxmlformats.org/officeDocument/2006/math" xmlns:v="urn:schemas-microsoft-com:vml" xmlns:wp14="http://schemas.microsoft.com/office/word/2010/wordprocessingDrawing" xmlns:wp="http://schemas.openxmlformats.org/drawingml/2006/wordprocessingDrawing" xmlns:w10="urn:schemas-microsoft-com:office:word" xmlns:w="http://schemas.openxmlformats.org/wordprocessingml/2006/main" xmlns:w14="http://schemas.microsoft.com/office/word/2010/wordml" xmlns:w15="http://schemas.microsoft.com/office/word/2012/wordml" xmlns:w16cex="http://schemas.microsoft.com/office/word/2018/wordml/cex" xmlns:w16cid="http://schemas.microsoft.com/office/word/2016/wordml/cid" xmlns:w16="http://schemas.microsoft.com/office/word/2018/wordml" xmlns:w16du="http://schemas.microsoft.com/office/word/2023/wordml/word16du" xmlns:w16sdtdh="http://schemas.microsoft.com/office/word/2020/wordml/sdtdatahash" xmlns:w16sdtfl="http://schemas.microsoft.com/office/word/2024/wordml/sdtformatlock" xmlns:w16se="http://schemas.microsoft.com/office/word/2015/wordml/symex" xmlns:wpg="http://schemas.microsoft.com/office/word/2010/wordprocessingGroup" xmlns:wpi="http://schemas.microsoft.com/office/word/2010/wordprocessingInk" xmlns:wne="http://schemas.microsoft.com/office/word/2006/wordml" xmlns:wps="http://schemas.microsoft.com/office/word/2010/wordprocessingShape" mc:Ignorable="w14 w15 w16se w16cid w16 w16cex w16sdtdh w16sdtfl w16du wp14">
+  <w:p>
+    <w:pPr>
+      <w:pStyle w:val="Footer"/>
       <w:jc w:val="center"/>
     </w:pPr>
-    <w:proofErr w:type="spellStart"/>
-    <w:r>
-      <w:rPr>
-        <w:sz w:val="16"/>
-      </w:rPr>
-      <w:t>InternMatch</w:t>
-    </w:r>
-    <w:proofErr w:type="spellEnd"/>
-    <w:r>
-      <w:rPr>
-        <w:sz w:val="16"/>
-      </w:rPr>
-      <w:t xml:space="preserve"> Team Development Guide</w:t>
-    </w:r>
+  </w:p>
+</w:ftr>
+</file>
+
+<file path=word/footer3.xml><?xml version="1.0" encoding="utf-8"?>
+<w:ftr xmlns:wpc="http://schemas.microsoft.com/office/word/2010/wordprocessingCanvas" xmlns:cx="http://schemas.microsoft.com/office/drawing/2014/chartex" xmlns:cx1="http://schemas.microsoft.com/office/drawing/2015/9/8/chartex" xmlns:cx2="http://schemas.microsoft.com/office/drawing/2015/10/21/chartex" xmlns:cx3="http://schemas.microsoft.com/office/drawing/2016/5/9/chartex" xmlns:cx4="http://schemas.microsoft.com/office/drawing/2016/5/10/chartex" xmlns:cx5="http://schemas.microsoft.com/office/drawing/2016/5/11/chartex" xmlns:cx6="http://schemas.microsoft.com/office/drawing/2016/5/12/chartex" xmlns:cx7="http://schemas.microsoft.com/office/drawing/2016/5/13/chartex" xmlns:cx8="http://schemas.microsoft.com/office/drawing/2016/5/14/chartex" xmlns:mc="http://schemas.openxmlformats.org/markup-compatibility/2006" xmlns:aink="http://schemas.microsoft.com/office/drawing/2016/ink" xmlns:am3d="http://schemas.microsoft.com/office/drawing/2017/model3d" xmlns:o="urn:schemas-microsoft-com:office:office" xmlns:oel="http://schemas.microsoft.com/office/2019/extlst" xmlns:r="http://schemas.openxmlformats.org/officeDocument/2006/relationships" xmlns:m="http://schemas.openxmlformats.org/officeDocument/2006/math" xmlns:v="urn:schemas-microsoft-com:vml" xmlns:wp14="http://schemas.microsoft.com/office/word/2010/wordprocessingDrawing" xmlns:wp="http://schemas.openxmlformats.org/drawingml/2006/wordprocessingDrawing" xmlns:w10="urn:schemas-microsoft-com:office:word" xmlns:w="http://schemas.openxmlformats.org/wordprocessingml/2006/main" xmlns:w14="http://schemas.microsoft.com/office/word/2010/wordml" xmlns:w15="http://schemas.microsoft.com/office/word/2012/wordml" xmlns:w16cex="http://schemas.microsoft.com/office/word/2018/wordml/cex" xmlns:w16cid="http://schemas.microsoft.com/office/word/2016/wordml/cid" xmlns:w16="http://schemas.microsoft.com/office/word/2018/wordml" xmlns:w16du="http://schemas.microsoft.com/office/word/2023/wordml/word16du" xmlns:w16sdtdh="http://schemas.microsoft.com/office/word/2020/wordml/sdtdatahash" xmlns:w16sdtfl="http://schemas.microsoft.com/office/word/2024/wordml/sdtformatlock" xmlns:w16se="http://schemas.microsoft.com/office/word/2015/wordml/symex" xmlns:wpg="http://schemas.microsoft.com/office/word/2010/wordprocessingGroup" xmlns:wpi="http://schemas.microsoft.com/office/word/2010/wordprocessingInk" xmlns:wne="http://schemas.microsoft.com/office/word/2006/wordml" xmlns:wps="http://schemas.microsoft.com/office/word/2010/wordprocessingShape" mc:Ignorable="w14 w15 w16se w16cid w16 w16cex w16sdtdh w16sdtfl w16du wp14">
+  <w:p>
+    <w:pPr>
+      <w:pStyle w:val="Footer"/>
+    </w:pPr>
   </w:p>
 </w:ftr>
 </file>
@@ -23076,6 +23866,45 @@
     </w:p>
   </w:footnote>
 </w:footnotes>
+</file>
+
+<file path=word/header1.xml><?xml version="1.0" encoding="utf-8"?>
+<w:hdr xmlns:wpc="http://schemas.microsoft.com/office/word/2010/wordprocessingCanvas" xmlns:cx="http://schemas.microsoft.com/office/drawing/2014/chartex" xmlns:cx1="http://schemas.microsoft.com/office/drawing/2015/9/8/chartex" xmlns:cx2="http://schemas.microsoft.com/office/drawing/2015/10/21/chartex" xmlns:cx3="http://schemas.microsoft.com/office/drawing/2016/5/9/chartex" xmlns:cx4="http://schemas.microsoft.com/office/drawing/2016/5/10/chartex" xmlns:cx5="http://schemas.microsoft.com/office/drawing/2016/5/11/chartex" xmlns:cx6="http://schemas.microsoft.com/office/drawing/2016/5/12/chartex" xmlns:cx7="http://schemas.microsoft.com/office/drawing/2016/5/13/chartex" xmlns:cx8="http://schemas.microsoft.com/office/drawing/2016/5/14/chartex" xmlns:mc="http://schemas.openxmlformats.org/markup-compatibility/2006" xmlns:aink="http://schemas.microsoft.com/office/drawing/2016/ink" xmlns:am3d="http://schemas.microsoft.com/office/drawing/2017/model3d" xmlns:o="urn:schemas-microsoft-com:office:office" xmlns:oel="http://schemas.microsoft.com/office/2019/extlst" xmlns:r="http://schemas.openxmlformats.org/officeDocument/2006/relationships" xmlns:m="http://schemas.openxmlformats.org/officeDocument/2006/math" xmlns:v="urn:schemas-microsoft-com:vml" xmlns:wp14="http://schemas.microsoft.com/office/word/2010/wordprocessingDrawing" xmlns:wp="http://schemas.openxmlformats.org/drawingml/2006/wordprocessingDrawing" xmlns:w10="urn:schemas-microsoft-com:office:word" xmlns:w="http://schemas.openxmlformats.org/wordprocessingml/2006/main" xmlns:w14="http://schemas.microsoft.com/office/word/2010/wordml" xmlns:w15="http://schemas.microsoft.com/office/word/2012/wordml" xmlns:w16cex="http://schemas.microsoft.com/office/word/2018/wordml/cex" xmlns:w16cid="http://schemas.microsoft.com/office/word/2016/wordml/cid" xmlns:w16="http://schemas.microsoft.com/office/word/2018/wordml" xmlns:w16du="http://schemas.microsoft.com/office/word/2023/wordml/word16du" xmlns:w16sdtdh="http://schemas.microsoft.com/office/word/2020/wordml/sdtdatahash" xmlns:w16sdtfl="http://schemas.microsoft.com/office/word/2024/wordml/sdtformatlock" xmlns:w16se="http://schemas.microsoft.com/office/word/2015/wordml/symex" xmlns:wpg="http://schemas.microsoft.com/office/word/2010/wordprocessingGroup" xmlns:wpi="http://schemas.microsoft.com/office/word/2010/wordprocessingInk" xmlns:wne="http://schemas.microsoft.com/office/word/2006/wordml" xmlns:wps="http://schemas.microsoft.com/office/word/2010/wordprocessingShape" mc:Ignorable="w14 w15 w16se w16cid w16 w16cex w16sdtdh w16sdtfl w16du wp14">
+  <w:p>
+    <w:pPr>
+      <w:pStyle w:val="Header"/>
+    </w:pPr>
+  </w:p>
+</w:hdr>
+</file>
+
+<file path=word/header2.xml><?xml version="1.0" encoding="utf-8"?>
+<w:hdr xmlns:wpc="http://schemas.microsoft.com/office/word/2010/wordprocessingCanvas" xmlns:cx="http://schemas.microsoft.com/office/drawing/2014/chartex" xmlns:cx1="http://schemas.microsoft.com/office/drawing/2015/9/8/chartex" xmlns:cx2="http://schemas.microsoft.com/office/drawing/2015/10/21/chartex" xmlns:cx3="http://schemas.microsoft.com/office/drawing/2016/5/9/chartex" xmlns:cx4="http://schemas.microsoft.com/office/drawing/2016/5/10/chartex" xmlns:cx5="http://schemas.microsoft.com/office/drawing/2016/5/11/chartex" xmlns:cx6="http://schemas.microsoft.com/office/drawing/2016/5/12/chartex" xmlns:cx7="http://schemas.microsoft.com/office/drawing/2016/5/13/chartex" xmlns:cx8="http://schemas.microsoft.com/office/drawing/2016/5/14/chartex" xmlns:mc="http://schemas.openxmlformats.org/markup-compatibility/2006" xmlns:aink="http://schemas.microsoft.com/office/drawing/2016/ink" xmlns:am3d="http://schemas.microsoft.com/office/drawing/2017/model3d" xmlns:o="urn:schemas-microsoft-com:office:office" xmlns:oel="http://schemas.microsoft.com/office/2019/extlst" xmlns:r="http://schemas.openxmlformats.org/officeDocument/2006/relationships" xmlns:m="http://schemas.openxmlformats.org/officeDocument/2006/math" xmlns:v="urn:schemas-microsoft-com:vml" xmlns:wp14="http://schemas.microsoft.com/office/word/2010/wordprocessingDrawing" xmlns:wp="http://schemas.openxmlformats.org/drawingml/2006/wordprocessingDrawing" xmlns:w10="urn:schemas-microsoft-com:office:word" xmlns:w="http://schemas.openxmlformats.org/wordprocessingml/2006/main" xmlns:w14="http://schemas.microsoft.com/office/word/2010/wordml" xmlns:w15="http://schemas.microsoft.com/office/word/2012/wordml" xmlns:w16cex="http://schemas.microsoft.com/office/word/2018/wordml/cex" xmlns:w16cid="http://schemas.microsoft.com/office/word/2016/wordml/cid" xmlns:w16="http://schemas.microsoft.com/office/word/2018/wordml" xmlns:w16du="http://schemas.microsoft.com/office/word/2023/wordml/word16du" xmlns:w16sdtdh="http://schemas.microsoft.com/office/word/2020/wordml/sdtdatahash" xmlns:w16sdtfl="http://schemas.microsoft.com/office/word/2024/wordml/sdtformatlock" xmlns:w16se="http://schemas.microsoft.com/office/word/2015/wordml/symex" xmlns:wpg="http://schemas.microsoft.com/office/word/2010/wordprocessingGroup" xmlns:wpi="http://schemas.microsoft.com/office/word/2010/wordprocessingInk" xmlns:wne="http://schemas.microsoft.com/office/word/2006/wordml" xmlns:wps="http://schemas.microsoft.com/office/word/2010/wordprocessingShape" mc:Ignorable="w14 w15 w16se w16cid w16 w16cex w16sdtdh w16sdtfl w16du wp14">
+  <w:p>
+    <w:pPr>
+      <w:pStyle w:val="Header"/>
+      <w:rPr>
+        <w:lang w:val="en-PH"/>
+      </w:rPr>
+    </w:pPr>
+    <w:r>
+      <w:rPr>
+        <w:lang w:val="en-PH"/>
+      </w:rPr>
+      <w:t>9/19/26</w:t>
+    </w:r>
+  </w:p>
+</w:hdr>
+</file>
+
+<file path=word/header3.xml><?xml version="1.0" encoding="utf-8"?>
+<w:hdr xmlns:wpc="http://schemas.microsoft.com/office/word/2010/wordprocessingCanvas" xmlns:cx="http://schemas.microsoft.com/office/drawing/2014/chartex" xmlns:cx1="http://schemas.microsoft.com/office/drawing/2015/9/8/chartex" xmlns:cx2="http://schemas.microsoft.com/office/drawing/2015/10/21/chartex" xmlns:cx3="http://schemas.microsoft.com/office/drawing/2016/5/9/chartex" xmlns:cx4="http://schemas.microsoft.com/office/drawing/2016/5/10/chartex" xmlns:cx5="http://schemas.microsoft.com/office/drawing/2016/5/11/chartex" xmlns:cx6="http://schemas.microsoft.com/office/drawing/2016/5/12/chartex" xmlns:cx7="http://schemas.microsoft.com/office/drawing/2016/5/13/chartex" xmlns:cx8="http://schemas.microsoft.com/office/drawing/2016/5/14/chartex" xmlns:mc="http://schemas.openxmlformats.org/markup-compatibility/2006" xmlns:aink="http://schemas.microsoft.com/office/drawing/2016/ink" xmlns:am3d="http://schemas.microsoft.com/office/drawing/2017/model3d" xmlns:o="urn:schemas-microsoft-com:office:office" xmlns:oel="http://schemas.microsoft.com/office/2019/extlst" xmlns:r="http://schemas.openxmlformats.org/officeDocument/2006/relationships" xmlns:m="http://schemas.openxmlformats.org/officeDocument/2006/math" xmlns:v="urn:schemas-microsoft-com:vml" xmlns:wp14="http://schemas.microsoft.com/office/word/2010/wordprocessingDrawing" xmlns:wp="http://schemas.openxmlformats.org/drawingml/2006/wordprocessingDrawing" xmlns:w10="urn:schemas-microsoft-com:office:word" xmlns:w="http://schemas.openxmlformats.org/wordprocessingml/2006/main" xmlns:w14="http://schemas.microsoft.com/office/word/2010/wordml" xmlns:w15="http://schemas.microsoft.com/office/word/2012/wordml" xmlns:w16cex="http://schemas.microsoft.com/office/word/2018/wordml/cex" xmlns:w16cid="http://schemas.microsoft.com/office/word/2016/wordml/cid" xmlns:w16="http://schemas.microsoft.com/office/word/2018/wordml" xmlns:w16du="http://schemas.microsoft.com/office/word/2023/wordml/word16du" xmlns:w16sdtdh="http://schemas.microsoft.com/office/word/2020/wordml/sdtdatahash" xmlns:w16sdtfl="http://schemas.microsoft.com/office/word/2024/wordml/sdtformatlock" xmlns:w16se="http://schemas.microsoft.com/office/word/2015/wordml/symex" xmlns:wpg="http://schemas.microsoft.com/office/word/2010/wordprocessingGroup" xmlns:wpi="http://schemas.microsoft.com/office/word/2010/wordprocessingInk" xmlns:wne="http://schemas.microsoft.com/office/word/2006/wordml" xmlns:wps="http://schemas.microsoft.com/office/word/2010/wordprocessingShape" mc:Ignorable="w14 w15 w16se w16cid w16 w16cex w16sdtdh w16sdtfl w16du wp14">
+  <w:p>
+    <w:pPr>
+      <w:pStyle w:val="Header"/>
+    </w:pPr>
+  </w:p>
+</w:hdr>
 </file>
 
 <file path=word/numbering.xml><?xml version="1.0" encoding="utf-8"?>
@@ -23888,7 +24717,6 @@
   <w:style w:type="character" w:default="1" w:styleId="DefaultParagraphFont">
     <w:name w:val="Default Paragraph Font"/>
     <w:uiPriority w:val="1"/>
-    <w:semiHidden/>
     <w:unhideWhenUsed/>
   </w:style>
   <w:style w:type="table" w:default="1" w:styleId="TableNormal">

</xml_diff>